<commit_message>
Make paper submission-ready + add speaker notes to all 20 slides
Paper (Cultural_..._Submission_Draft .md/.html/.pdf/.docx):
- Fleshed out §2 Background across deixis (Bühler, Levinson, Silverstein, Hanks),
  Yoruba linguistics & relational ethics (Bamgbose, Awobuluyi, Gbadegesin, Hallen
  & Sodipo, Gyekye), and multilingual moral-eval / alignment (Hendrycks, Jiang,
  Arora, Ramezani & Xu, Durmus, Atari, Hämmerl, Ouyang, Bai; trolley: Foot, Thomson)
- Added Table 1 (compact open-arm headline results)
- Replaced the references placeholder with a real, verifiable reference list
  (flagged: verify pages/DOIs; complete self-citation on de-anonymization)

Presentation: added presenter speaker notes to all 20 slides (build_presentation.py).

Co-Authored-By: Claude Opus 4.8 (1M context) <noreply@anthropic.com>
</commit_message>
<xml_diff>
--- a/deixis_analysis_pipeline/yoruba_cross_linguistic_analysis/Article_Yoruba_Deixis_Enhanced.docx
+++ b/deixis_analysis_pipeline/yoruba_cross_linguistic_analysis/Article_Yoruba_Deixis_Enhanced.docx
@@ -411,7 +411,154 @@
     </w:p>
     <w:p>
       <w:r>
-        <w:t xml:space="preserve">The study builds on an earlier English-only analysis that found deictic framing reshapes moral reasoning. The open question this paper addresses is whether such effects </w:t>
+        <w:rPr>
+          <w:b/>
+        </w:rPr>
+        <w:t>Deixis and indexical stance.</w:t>
+      </w:r>
+      <w:r>
+        <w:t xml:space="preserve"> Deixis — the class of expressions whose interpretation depends on the speech situation (person, place, time, discourse) — has long been treated as more than reference. Bühler (1934/1990) located it in a "deictic field" centered on the speaker; Levinson (1983, 2004) systematized person, place, and time deixis within pragmatics; and Silverstein (1976) and Hanks (1992) showed that indexicals are </w:t>
+      </w:r>
+      <w:r>
+        <w:rPr>
+          <w:i/>
+        </w:rPr>
+        <w:t>interactional</w:t>
+      </w:r>
+      <w:r>
+        <w:t xml:space="preserve">, organizing who is foregrounded and how stance is distributed in a speech event. We take this further into the moral domain: a dilemma posed as "I must decide," "you must decide," or "we must decide" relocates moral responsibility, not merely the referent. The first-person system is the sharpest site of this work, because it is where a speaker can mark </w:t>
+      </w:r>
+      <w:r>
+        <w:rPr>
+          <w:i/>
+        </w:rPr>
+        <w:t>how strongly</w:t>
+      </w:r>
+      <w:r>
+        <w:t xml:space="preserve"> they own a claim.</w:t>
+      </w:r>
+    </w:p>
+    <w:p>
+      <w:r>
+        <w:rPr>
+          <w:b/>
+        </w:rPr>
+        <w:t>Yoruba first-person morphology and relational ethics.</w:t>
+      </w:r>
+      <w:r>
+        <w:t xml:space="preserve"> Yoruba grammars distinguish the ordinary subject pronoun </w:t>
+      </w:r>
+      <w:r>
+        <w:rPr>
+          <w:i/>
+        </w:rPr>
+        <w:t>mo</w:t>
+      </w:r>
+      <w:r>
+        <w:t xml:space="preserve"> from the independent/emphatic </w:t>
+      </w:r>
+      <w:r>
+        <w:rPr>
+          <w:i/>
+        </w:rPr>
+        <w:t>èmi</w:t>
+      </w:r>
+      <w:r>
+        <w:t xml:space="preserve"> and the object/possessive </w:t>
+      </w:r>
+      <w:r>
+        <w:rPr>
+          <w:i/>
+        </w:rPr>
+        <w:t>mi</w:t>
+      </w:r>
+      <w:r>
+        <w:t xml:space="preserve"> (Bamgboṣe, 1966; Awobuluyi, 1978); the independent pronoun carries contrastive and focal force, making it a resource for avowal rather than mere self-reference. This grammatical contrast sits within a moral tradition often described as relational and character-centered — </w:t>
+      </w:r>
+      <w:r>
+        <w:rPr>
+          <w:i/>
+        </w:rPr>
+        <w:t>ìwà</w:t>
+      </w:r>
+      <w:r>
+        <w:t xml:space="preserve"> (character), </w:t>
+      </w:r>
+      <w:r>
+        <w:rPr>
+          <w:i/>
+        </w:rPr>
+        <w:t>ojúṣe</w:t>
+      </w:r>
+      <w:r>
+        <w:t xml:space="preserve"> (responsibility/duty), and communal accountability (Gbadegesin, 1991; Hallen &amp; Sodipo, 1986; Gyekye, 1995) — in which foregrounding the individual self is not automatically the marked-as-serious choice. A reliable computational treatment must also separate </w:t>
+      </w:r>
+      <w:r>
+        <w:rPr>
+          <w:i/>
+        </w:rPr>
+        <w:t>èmi</w:t>
+      </w:r>
+      <w:r>
+        <w:t xml:space="preserve"> ("I myself") from the tonal homograph </w:t>
+      </w:r>
+      <w:r>
+        <w:rPr>
+          <w:i/>
+        </w:rPr>
+        <w:t>ẹ̀mí</w:t>
+      </w:r>
+      <w:r>
+        <w:t xml:space="preserve"> ("life/spirit"), which is frequent in life-and-death dilemmas.</w:t>
+      </w:r>
+    </w:p>
+    <w:p>
+      <w:r>
+        <w:rPr>
+          <w:b/>
+        </w:rPr>
+        <w:t>Cross-cultural and multilingual moral reasoning in LLMs.</w:t>
+      </w:r>
+      <w:r>
+        <w:t xml:space="preserve"> A growing literature probes whether LLMs encode culturally specific values and morals. Work on moral knowledge and judgment includes the ETHICS benchmark (Hendrycks et al., 2021) and the Delphi experiment (Jiang et al., 2021); cross-cultural value probing includes Arora et al. (2023), Ramezani &amp; Xu (2023), Durmus et al. (2023), and critiques of WEIRD-skewed model "psychology" (Atari et al., 2023). Most relevant here, Hämmerl et al. (2023) show that the </w:t>
+      </w:r>
+      <w:r>
+        <w:rPr>
+          <w:i/>
+        </w:rPr>
+        <w:t>language of the prompt</w:t>
+      </w:r>
+      <w:r>
+        <w:t xml:space="preserve"> shifts the moral bias of multilingual models. Alignment via RLHF and Constitutional methods (Ouyang et al., 2022; Bai et al., 2022) is tuned predominantly on English, raising the question of whether its even-handed, hedging register transfers to other languages. Our dilemmas draw on the moral-psychology tradition of the trolley problem (Foot, 1967; Thomson, 1985).</w:t>
+      </w:r>
+    </w:p>
+    <w:p>
+      <w:r>
+        <w:rPr>
+          <w:b/>
+        </w:rPr>
+        <w:t>This study's gap.</w:t>
+      </w:r>
+      <w:r>
+        <w:t xml:space="preserve"> Prior multilingual-evaluation work largely treats translation as content-preserving and rarely examines </w:t>
+      </w:r>
+      <w:r>
+        <w:rPr>
+          <w:i/>
+        </w:rPr>
+        <w:t>deictic</w:t>
+      </w:r>
+      <w:r>
+        <w:t xml:space="preserve"> manipulation, the fine-grained morphology of moral self-positioning, or a </w:t>
+      </w:r>
+      <w:r>
+        <w:rPr>
+          <w:b/>
+        </w:rPr>
+        <w:t>native</w:t>
+      </w:r>
+      <w:r>
+        <w:t xml:space="preserve"> comparison model. We build on an earlier English-only analysis that found deictic framing reshapes moral reasoning, and ask whether such effects </w:t>
       </w:r>
       <w:r>
         <w:rPr>
@@ -420,7 +567,16 @@
         <w:t>transfer</w:t>
       </w:r>
       <w:r>
-        <w:t xml:space="preserve"> to a typologically and culturally distant language once the corpus is recoded into a shared schema — and whether a Yoruba/Nigeria-native model behaves like the Western cloud models or diverges. Prior multilingual-evaluation work largely treats translation as content-preserving; we instead treat the output language as a participant in the moral performance.</w:t>
+        <w:t xml:space="preserve"> to Yoruba once the corpus is recoded into a shared schema — treating the output language as a </w:t>
+      </w:r>
+      <w:r>
+        <w:rPr>
+          <w:i/>
+        </w:rPr>
+        <w:t>participant</w:t>
+      </w:r>
+      <w:r>
+        <w:t xml:space="preserve"> in the moral performance, and adding a Yoruba-native model (N-ATLaS) to separate linguistic affordance from how Western cloud models inhabit it.</w:t>
       </w:r>
     </w:p>
     <w:p>
@@ -811,6 +967,492 @@
       </w:r>
     </w:p>
     <w:p>
+      <w:r>
+        <w:rPr>
+          <w:b/>
+        </w:rPr>
+        <w:t>Table 1. Open-arm headline results.</w:t>
+      </w:r>
+      <w:r>
+        <w:t xml:space="preserve"> Cross-language rows compare the English baseline with open Yoruba (GPT-4o + Claude + DeepSeek, N = 162/language); the emphatic gradient is the four-model open Yoruba set.</w:t>
+      </w:r>
+    </w:p>
+    <w:tbl>
+      <w:tblPr>
+        <w:tblStyle w:val="LightGrid-Accent1"/>
+        <w:tblW w:type="auto" w:w="0"/>
+        <w:tblLook w:firstColumn="1" w:firstRow="1" w:lastColumn="0" w:lastRow="0" w:noHBand="0" w:noVBand="1" w:val="04A0"/>
+      </w:tblPr>
+      <w:tblGrid>
+        <w:gridCol w:w="2160"/>
+        <w:gridCol w:w="2160"/>
+        <w:gridCol w:w="2160"/>
+        <w:gridCol w:w="2160"/>
+      </w:tblGrid>
+      <w:tr>
+        <w:tc>
+          <w:tcPr>
+            <w:tcW w:type="dxa" w:w="2160"/>
+          </w:tcPr>
+          <w:p>
+            <w:r>
+              <w:rPr>
+                <w:b/>
+              </w:rPr>
+              <w:t>Measure (open arm)</w:t>
+            </w:r>
+          </w:p>
+        </w:tc>
+        <w:tc>
+          <w:tcPr>
+            <w:tcW w:type="dxa" w:w="2160"/>
+          </w:tcPr>
+          <w:p>
+            <w:r>
+              <w:rPr>
+                <w:b/>
+              </w:rPr>
+              <w:t>English</w:t>
+            </w:r>
+          </w:p>
+        </w:tc>
+        <w:tc>
+          <w:tcPr>
+            <w:tcW w:type="dxa" w:w="2160"/>
+          </w:tcPr>
+          <w:p>
+            <w:r>
+              <w:rPr>
+                <w:b/>
+              </w:rPr>
+              <w:t>Yoruba</w:t>
+            </w:r>
+          </w:p>
+        </w:tc>
+        <w:tc>
+          <w:tcPr>
+            <w:tcW w:type="dxa" w:w="2160"/>
+          </w:tcPr>
+          <w:p>
+            <w:r>
+              <w:rPr>
+                <w:b/>
+              </w:rPr>
+              <w:t>Test</w:t>
+            </w:r>
+          </w:p>
+        </w:tc>
+      </w:tr>
+      <w:tr>
+        <w:tc>
+          <w:tcPr>
+            <w:tcW w:type="dxa" w:w="2160"/>
+          </w:tcPr>
+          <w:p>
+            <w:r>
+              <w:t>Differentiated (non-"mixed") ethic</w:t>
+            </w:r>
+          </w:p>
+        </w:tc>
+        <w:tc>
+          <w:tcPr>
+            <w:tcW w:type="dxa" w:w="2160"/>
+          </w:tcPr>
+          <w:p>
+            <w:r>
+              <w:t>12%</w:t>
+            </w:r>
+          </w:p>
+        </w:tc>
+        <w:tc>
+          <w:tcPr>
+            <w:tcW w:type="dxa" w:w="2160"/>
+          </w:tcPr>
+          <w:p>
+            <w:r>
+              <w:rPr>
+                <w:b/>
+              </w:rPr>
+              <w:t>44%</w:t>
+            </w:r>
+          </w:p>
+        </w:tc>
+        <w:tc>
+          <w:tcPr>
+            <w:tcW w:type="dxa" w:w="2160"/>
+          </w:tcPr>
+          <w:p>
+            <w:r>
+              <w:t xml:space="preserve">z = 6.3, </w:t>
+            </w:r>
+            <w:r>
+              <w:rPr>
+                <w:i/>
+              </w:rPr>
+              <w:t>p</w:t>
+            </w:r>
+            <w:r>
+              <w:t xml:space="preserve"> &lt; 0.001</w:t>
+            </w:r>
+          </w:p>
+        </w:tc>
+      </w:tr>
+      <w:tr>
+        <w:tc>
+          <w:tcPr>
+            <w:tcW w:type="dxa" w:w="2160"/>
+          </w:tcPr>
+          <w:p>
+            <w:r>
+              <w:t>Commits to a side</w:t>
+            </w:r>
+          </w:p>
+        </w:tc>
+        <w:tc>
+          <w:tcPr>
+            <w:tcW w:type="dxa" w:w="2160"/>
+          </w:tcPr>
+          <w:p>
+            <w:r>
+              <w:t>18%</w:t>
+            </w:r>
+          </w:p>
+        </w:tc>
+        <w:tc>
+          <w:tcPr>
+            <w:tcW w:type="dxa" w:w="2160"/>
+          </w:tcPr>
+          <w:p>
+            <w:r>
+              <w:rPr>
+                <w:b/>
+              </w:rPr>
+              <w:t>28%</w:t>
+            </w:r>
+          </w:p>
+        </w:tc>
+        <w:tc>
+          <w:tcPr>
+            <w:tcW w:type="dxa" w:w="2160"/>
+          </w:tcPr>
+          <w:p>
+            <w:r>
+              <w:t xml:space="preserve">z = 2.1, </w:t>
+            </w:r>
+            <w:r>
+              <w:rPr>
+                <w:i/>
+              </w:rPr>
+              <w:t>p</w:t>
+            </w:r>
+            <w:r>
+              <w:t xml:space="preserve"> = 0.034</w:t>
+            </w:r>
+          </w:p>
+        </w:tc>
+      </w:tr>
+      <w:tr>
+        <w:tc>
+          <w:tcPr>
+            <w:tcW w:type="dxa" w:w="2160"/>
+          </w:tcPr>
+          <w:p>
+            <w:r>
+              <w:t>Refuses to commit</w:t>
+            </w:r>
+          </w:p>
+        </w:tc>
+        <w:tc>
+          <w:tcPr>
+            <w:tcW w:type="dxa" w:w="2160"/>
+          </w:tcPr>
+          <w:p>
+            <w:r>
+              <w:t>21%</w:t>
+            </w:r>
+          </w:p>
+        </w:tc>
+        <w:tc>
+          <w:tcPr>
+            <w:tcW w:type="dxa" w:w="2160"/>
+          </w:tcPr>
+          <w:p>
+            <w:r>
+              <w:t>20%</w:t>
+            </w:r>
+          </w:p>
+        </w:tc>
+        <w:tc>
+          <w:tcPr>
+            <w:tcW w:type="dxa" w:w="2160"/>
+          </w:tcPr>
+          <w:p>
+            <w:r>
+              <w:t>n.s.</w:t>
+            </w:r>
+          </w:p>
+        </w:tc>
+      </w:tr>
+      <w:tr>
+        <w:tc>
+          <w:tcPr>
+            <w:tcW w:type="dxa" w:w="2160"/>
+          </w:tcPr>
+          <w:p>
+            <w:r>
+              <w:t>Contains a direct imperative</w:t>
+            </w:r>
+          </w:p>
+        </w:tc>
+        <w:tc>
+          <w:tcPr>
+            <w:tcW w:type="dxa" w:w="2160"/>
+          </w:tcPr>
+          <w:p>
+            <w:r>
+              <w:t>5%</w:t>
+            </w:r>
+          </w:p>
+        </w:tc>
+        <w:tc>
+          <w:tcPr>
+            <w:tcW w:type="dxa" w:w="2160"/>
+          </w:tcPr>
+          <w:p>
+            <w:r>
+              <w:rPr>
+                <w:b/>
+              </w:rPr>
+              <w:t>15%</w:t>
+            </w:r>
+          </w:p>
+        </w:tc>
+        <w:tc>
+          <w:tcPr>
+            <w:tcW w:type="dxa" w:w="2160"/>
+          </w:tcPr>
+          <w:p>
+            <w:r>
+              <w:t xml:space="preserve">z = 3.1, </w:t>
+            </w:r>
+            <w:r>
+              <w:rPr>
+                <w:i/>
+              </w:rPr>
+              <w:t>p</w:t>
+            </w:r>
+            <w:r>
+              <w:t xml:space="preserve"> = 0.002</w:t>
+            </w:r>
+          </w:p>
+        </w:tc>
+      </w:tr>
+      <w:tr>
+        <w:tc>
+          <w:tcPr>
+            <w:tcW w:type="dxa" w:w="2160"/>
+          </w:tcPr>
+          <w:p>
+            <w:r>
+              <w:t>Strong deictic uptake</w:t>
+            </w:r>
+          </w:p>
+        </w:tc>
+        <w:tc>
+          <w:tcPr>
+            <w:tcW w:type="dxa" w:w="2160"/>
+          </w:tcPr>
+          <w:p>
+            <w:r>
+              <w:t>76%</w:t>
+            </w:r>
+          </w:p>
+        </w:tc>
+        <w:tc>
+          <w:tcPr>
+            <w:tcW w:type="dxa" w:w="2160"/>
+          </w:tcPr>
+          <w:p>
+            <w:r>
+              <w:rPr>
+                <w:b/>
+              </w:rPr>
+              <w:t>88%</w:t>
+            </w:r>
+          </w:p>
+        </w:tc>
+        <w:tc>
+          <w:tcPr>
+            <w:tcW w:type="dxa" w:w="2160"/>
+          </w:tcPr>
+          <w:p>
+            <w:r>
+              <w:t>—</w:t>
+            </w:r>
+          </w:p>
+        </w:tc>
+      </w:tr>
+      <w:tr>
+        <w:tc>
+          <w:tcPr>
+            <w:tcW w:type="dxa" w:w="2160"/>
+          </w:tcPr>
+          <w:p>
+            <w:r>
+              <w:t>Decision flips, same model+dilemma+frame</w:t>
+            </w:r>
+          </w:p>
+        </w:tc>
+        <w:tc>
+          <w:tcPr>
+            <w:tcW w:type="dxa" w:w="2160"/>
+          </w:tcPr>
+          <w:p>
+            <w:r>
+              <w:t>—</w:t>
+            </w:r>
+          </w:p>
+        </w:tc>
+        <w:tc>
+          <w:tcPr>
+            <w:tcW w:type="dxa" w:w="2160"/>
+          </w:tcPr>
+          <w:p>
+            <w:r>
+              <w:rPr>
+                <w:b/>
+              </w:rPr>
+              <w:t>48%</w:t>
+            </w:r>
+          </w:p>
+        </w:tc>
+        <w:tc>
+          <w:tcPr>
+            <w:tcW w:type="dxa" w:w="2160"/>
+          </w:tcPr>
+          <w:p>
+            <w:r>
+              <w:t>trolley 67%, whistleblower 63%</w:t>
+            </w:r>
+          </w:p>
+        </w:tc>
+      </w:tr>
+      <w:tr>
+        <w:tc>
+          <w:tcPr>
+            <w:tcW w:type="dxa" w:w="2160"/>
+          </w:tcPr>
+          <w:p>
+            <w:r>
+              <w:t>Frame → ethical-framework association</w:t>
+            </w:r>
+          </w:p>
+        </w:tc>
+        <w:tc>
+          <w:tcPr>
+            <w:tcW w:type="dxa" w:w="2160"/>
+          </w:tcPr>
+          <w:p>
+            <w:r>
+              <w:t>n.s.</w:t>
+            </w:r>
+          </w:p>
+        </w:tc>
+        <w:tc>
+          <w:tcPr>
+            <w:tcW w:type="dxa" w:w="2160"/>
+          </w:tcPr>
+          <w:p>
+            <w:r>
+              <w:t>n.s.</w:t>
+            </w:r>
+          </w:p>
+        </w:tc>
+        <w:tc>
+          <w:tcPr>
+            <w:tcW w:type="dxa" w:w="2160"/>
+          </w:tcPr>
+          <w:p>
+            <w:r>
+              <w:t xml:space="preserve">χ² </w:t>
+            </w:r>
+            <w:r>
+              <w:rPr>
+                <w:i/>
+              </w:rPr>
+              <w:t>p</w:t>
+            </w:r>
+            <w:r>
+              <w:t xml:space="preserve"> ≈ 0.78 / 0.72</w:t>
+            </w:r>
+          </w:p>
+        </w:tc>
+      </w:tr>
+      <w:tr>
+        <w:tc>
+          <w:tcPr>
+            <w:tcW w:type="dxa" w:w="2160"/>
+          </w:tcPr>
+          <w:p>
+            <w:r>
+              <w:t xml:space="preserve">Emphatic ratio </w:t>
+            </w:r>
+            <w:r>
+              <w:rPr>
+                <w:i/>
+              </w:rPr>
+              <w:t>èmi/(mo+èmi)</w:t>
+            </w:r>
+          </w:p>
+        </w:tc>
+        <w:tc>
+          <w:tcPr>
+            <w:tcW w:type="dxa" w:w="2160"/>
+          </w:tcPr>
+          <w:p>
+            <w:r>
+              <w:t xml:space="preserve">(no </w:t>
+            </w:r>
+            <w:r>
+              <w:rPr>
+                <w:i/>
+              </w:rPr>
+              <w:t>èmi</w:t>
+            </w:r>
+            <w:r>
+              <w:t xml:space="preserve"> in English)</w:t>
+            </w:r>
+          </w:p>
+        </w:tc>
+        <w:tc>
+          <w:tcPr>
+            <w:tcW w:type="dxa" w:w="2160"/>
+          </w:tcPr>
+          <w:p>
+            <w:r>
+              <w:t xml:space="preserve">Claude 0.32 · GPT-4o 0.18 · DeepSeek 0.07 · </w:t>
+            </w:r>
+            <w:r>
+              <w:rPr>
+                <w:b/>
+              </w:rPr>
+              <w:t>N-ATLaS 0.07</w:t>
+            </w:r>
+          </w:p>
+        </w:tc>
+        <w:tc>
+          <w:tcPr>
+            <w:tcW w:type="dxa" w:w="2160"/>
+          </w:tcPr>
+          <w:p>
+            <w:r>
+              <w:t>model gradient</w:t>
+            </w:r>
+          </w:p>
+        </w:tc>
+      </w:tr>
+    </w:tbl>
+    <w:p>
       <w:pPr>
         <w:pStyle w:val="Heading3"/>
       </w:pPr>
@@ -1826,7 +2468,363 @@
         <w:rPr>
           <w:i/>
         </w:rPr>
-        <w:t>(Retained from the working draft; to be completed for submission.)</w:t>
+        <w:t>These are real, widely-cited works in the relevant areas; please verify exact pages, editions, and DOIs against the original sources before submission, and replace the bracketed self-citation.</w:t>
+      </w:r>
+    </w:p>
+    <w:p>
+      <w:pPr>
+        <w:pStyle w:val="ListBullet"/>
+      </w:pPr>
+      <w:r>
+        <w:t xml:space="preserve">Arora, A., Kaffee, L.-A., &amp; Augenstein, I. (2023). Probing Pre-Trained Language Models for Cross-Cultural Differences in Values. </w:t>
+      </w:r>
+      <w:r>
+        <w:rPr>
+          <w:i/>
+        </w:rPr>
+        <w:t>Proceedings of the C3NLP Workshop, EACL 2023.</w:t>
+      </w:r>
+    </w:p>
+    <w:p>
+      <w:pPr>
+        <w:pStyle w:val="ListBullet"/>
+      </w:pPr>
+      <w:r>
+        <w:t xml:space="preserve">Atari, M., Xue, M. J., Park, P. S., Blasi, D., &amp; Henrich, J. (2023). Which Humans? </w:t>
+      </w:r>
+      <w:r>
+        <w:rPr>
+          <w:i/>
+        </w:rPr>
+        <w:t>PsyArXiv preprint.</w:t>
+      </w:r>
+    </w:p>
+    <w:p>
+      <w:pPr>
+        <w:pStyle w:val="ListBullet"/>
+      </w:pPr>
+      <w:r>
+        <w:t xml:space="preserve">Awobuluyi, O. (1978). </w:t>
+      </w:r>
+      <w:r>
+        <w:rPr>
+          <w:i/>
+        </w:rPr>
+        <w:t>Essentials of Yoruba Grammar.</w:t>
+      </w:r>
+      <w:r>
+        <w:t xml:space="preserve"> Oxford University Press / University Press Ltd, Ibadan.</w:t>
+      </w:r>
+    </w:p>
+    <w:p>
+      <w:pPr>
+        <w:pStyle w:val="ListBullet"/>
+      </w:pPr>
+      <w:r>
+        <w:t xml:space="preserve">Bai, Y., et al. (2022). Training a Helpful and Harmless Assistant with Reinforcement Learning from Human Feedback. </w:t>
+      </w:r>
+      <w:r>
+        <w:rPr>
+          <w:i/>
+        </w:rPr>
+        <w:t>arXiv:2204.05862.</w:t>
+      </w:r>
+      <w:r>
+        <w:t xml:space="preserve"> (See also Constitutional AI, </w:t>
+      </w:r>
+      <w:r>
+        <w:rPr>
+          <w:i/>
+        </w:rPr>
+        <w:t>arXiv:2212.08073.</w:t>
+      </w:r>
+      <w:r>
+        <w:t>)</w:t>
+      </w:r>
+    </w:p>
+    <w:p>
+      <w:pPr>
+        <w:pStyle w:val="ListBullet"/>
+      </w:pPr>
+      <w:r>
+        <w:t xml:space="preserve">Bamgboṣe, A. (1966). </w:t>
+      </w:r>
+      <w:r>
+        <w:rPr>
+          <w:i/>
+        </w:rPr>
+        <w:t>A Grammar of Yoruba.</w:t>
+      </w:r>
+      <w:r>
+        <w:t xml:space="preserve"> Cambridge University Press.</w:t>
+      </w:r>
+    </w:p>
+    <w:p>
+      <w:pPr>
+        <w:pStyle w:val="ListBullet"/>
+      </w:pPr>
+      <w:r>
+        <w:t xml:space="preserve">Bühler, K. (1934/1990). </w:t>
+      </w:r>
+      <w:r>
+        <w:rPr>
+          <w:i/>
+        </w:rPr>
+        <w:t>Theory of Language: The Representational Function of Language</w:t>
+      </w:r>
+      <w:r>
+        <w:t xml:space="preserve"> (trans. D. F. Goodwin). John Benjamins.</w:t>
+      </w:r>
+    </w:p>
+    <w:p>
+      <w:pPr>
+        <w:pStyle w:val="ListBullet"/>
+      </w:pPr>
+      <w:r>
+        <w:t xml:space="preserve">Durmus, E., et al. (2023). Towards Measuring the Representation of Subjective Global Opinions in Language Models. </w:t>
+      </w:r>
+      <w:r>
+        <w:rPr>
+          <w:i/>
+        </w:rPr>
+        <w:t>arXiv:2306.16388.</w:t>
+      </w:r>
+    </w:p>
+    <w:p>
+      <w:pPr>
+        <w:pStyle w:val="ListBullet"/>
+      </w:pPr>
+      <w:r>
+        <w:t xml:space="preserve">Foot, P. (1967). The Problem of Abortion and the Doctrine of Double Effect. </w:t>
+      </w:r>
+      <w:r>
+        <w:rPr>
+          <w:i/>
+        </w:rPr>
+        <w:t>Oxford Review, 5.</w:t>
+      </w:r>
+    </w:p>
+    <w:p>
+      <w:pPr>
+        <w:pStyle w:val="ListBullet"/>
+      </w:pPr>
+      <w:r>
+        <w:t xml:space="preserve">Gbadegesin, S. (1991). </w:t>
+      </w:r>
+      <w:r>
+        <w:rPr>
+          <w:i/>
+        </w:rPr>
+        <w:t>African Philosophy: Traditional Yoruba Philosophy and Contemporary African Realities.</w:t>
+      </w:r>
+      <w:r>
+        <w:t xml:space="preserve"> Peter Lang.</w:t>
+      </w:r>
+    </w:p>
+    <w:p>
+      <w:pPr>
+        <w:pStyle w:val="ListBullet"/>
+      </w:pPr>
+      <w:r>
+        <w:t xml:space="preserve">Gyekye, K. (1995). </w:t>
+      </w:r>
+      <w:r>
+        <w:rPr>
+          <w:i/>
+        </w:rPr>
+        <w:t>An Essay on African Philosophical Thought: The Akan Conceptual Scheme</w:t>
+      </w:r>
+      <w:r>
+        <w:t xml:space="preserve"> (rev. ed.). Temple University Press.</w:t>
+      </w:r>
+    </w:p>
+    <w:p>
+      <w:pPr>
+        <w:pStyle w:val="ListBullet"/>
+      </w:pPr>
+      <w:r>
+        <w:t xml:space="preserve">Hallen, B., &amp; Sodipo, J. O. (1986). </w:t>
+      </w:r>
+      <w:r>
+        <w:rPr>
+          <w:i/>
+        </w:rPr>
+        <w:t>Knowledge, Belief, and Witchcraft: Analytic Experiments in African Philosophy.</w:t>
+      </w:r>
+      <w:r>
+        <w:t xml:space="preserve"> Ethnographica.</w:t>
+      </w:r>
+    </w:p>
+    <w:p>
+      <w:pPr>
+        <w:pStyle w:val="ListBullet"/>
+      </w:pPr>
+      <w:r>
+        <w:t xml:space="preserve">Hämmerl, K., Deiseroth, B., Schramowski, P., et al. (2023). Speaking Multiple Languages Affects the Moral Bias of Language Models. </w:t>
+      </w:r>
+      <w:r>
+        <w:rPr>
+          <w:i/>
+        </w:rPr>
+        <w:t>Findings of the ACL 2023.</w:t>
+      </w:r>
+    </w:p>
+    <w:p>
+      <w:pPr>
+        <w:pStyle w:val="ListBullet"/>
+      </w:pPr>
+      <w:r>
+        <w:t xml:space="preserve">Hanks, W. F. (1992). The Indexical Ground of Deictic Reference. In A. Duranti &amp; C. Goodwin (Eds.), </w:t>
+      </w:r>
+      <w:r>
+        <w:rPr>
+          <w:i/>
+        </w:rPr>
+        <w:t>Rethinking Context</w:t>
+      </w:r>
+      <w:r>
+        <w:t xml:space="preserve"> (pp. 43–76). Cambridge University Press.</w:t>
+      </w:r>
+    </w:p>
+    <w:p>
+      <w:pPr>
+        <w:pStyle w:val="ListBullet"/>
+      </w:pPr>
+      <w:r>
+        <w:t xml:space="preserve">Hendrycks, D., et al. (2021). Aligning AI With Shared Human Values (ETHICS). </w:t>
+      </w:r>
+      <w:r>
+        <w:rPr>
+          <w:i/>
+        </w:rPr>
+        <w:t>ICLR 2021.</w:t>
+      </w:r>
+    </w:p>
+    <w:p>
+      <w:pPr>
+        <w:pStyle w:val="ListBullet"/>
+      </w:pPr>
+      <w:r>
+        <w:t xml:space="preserve">Jiang, L., et al. (2021). Can Machines Learn Morality? The Delphi Experiment. </w:t>
+      </w:r>
+      <w:r>
+        <w:rPr>
+          <w:i/>
+        </w:rPr>
+        <w:t>arXiv:2110.07574.</w:t>
+      </w:r>
+    </w:p>
+    <w:p>
+      <w:pPr>
+        <w:pStyle w:val="ListBullet"/>
+      </w:pPr>
+      <w:r>
+        <w:t xml:space="preserve">Levinson, S. C. (1983). </w:t>
+      </w:r>
+      <w:r>
+        <w:rPr>
+          <w:i/>
+        </w:rPr>
+        <w:t>Pragmatics.</w:t>
+      </w:r>
+      <w:r>
+        <w:t xml:space="preserve"> Cambridge University Press.</w:t>
+      </w:r>
+    </w:p>
+    <w:p>
+      <w:pPr>
+        <w:pStyle w:val="ListBullet"/>
+      </w:pPr>
+      <w:r>
+        <w:t xml:space="preserve">Levinson, S. C. (2004). Deixis. In L. R. Horn &amp; G. Ward (Eds.), </w:t>
+      </w:r>
+      <w:r>
+        <w:rPr>
+          <w:i/>
+        </w:rPr>
+        <w:t>The Handbook of Pragmatics</w:t>
+      </w:r>
+      <w:r>
+        <w:t xml:space="preserve"> (pp. 97–121). Blackwell.</w:t>
+      </w:r>
+    </w:p>
+    <w:p>
+      <w:pPr>
+        <w:pStyle w:val="ListBullet"/>
+      </w:pPr>
+      <w:r>
+        <w:t xml:space="preserve">Ouyang, L., et al. (2022). Training Language Models to Follow Instructions with Human Feedback. </w:t>
+      </w:r>
+      <w:r>
+        <w:rPr>
+          <w:i/>
+        </w:rPr>
+        <w:t>NeurIPS 2022.</w:t>
+      </w:r>
+    </w:p>
+    <w:p>
+      <w:pPr>
+        <w:pStyle w:val="ListBullet"/>
+      </w:pPr>
+      <w:r>
+        <w:t xml:space="preserve">Ramezani, A., &amp; Xu, Y. (2023). Knowledge of Cultural Moral Norms in Large Language Models. </w:t>
+      </w:r>
+      <w:r>
+        <w:rPr>
+          <w:i/>
+        </w:rPr>
+        <w:t>ACL 2023.</w:t>
+      </w:r>
+    </w:p>
+    <w:p>
+      <w:pPr>
+        <w:pStyle w:val="ListBullet"/>
+      </w:pPr>
+      <w:r>
+        <w:t xml:space="preserve">Silverstein, M. (1976). Shifters, Linguistic Categories, and Cultural Description. In K. Basso &amp; H. Selby (Eds.), </w:t>
+      </w:r>
+      <w:r>
+        <w:rPr>
+          <w:i/>
+        </w:rPr>
+        <w:t>Meaning in Anthropology</w:t>
+      </w:r>
+      <w:r>
+        <w:t xml:space="preserve"> (pp. 11–55). University of New Mexico Press.</w:t>
+      </w:r>
+    </w:p>
+    <w:p>
+      <w:pPr>
+        <w:pStyle w:val="ListBullet"/>
+      </w:pPr>
+      <w:r>
+        <w:t xml:space="preserve">Thomson, J. J. (1985). The Trolley Problem. </w:t>
+      </w:r>
+      <w:r>
+        <w:rPr>
+          <w:i/>
+        </w:rPr>
+        <w:t>The Yale Law Journal, 94</w:t>
+      </w:r>
+      <w:r>
+        <w:t>(6), 1395–1415.</w:t>
+      </w:r>
+    </w:p>
+    <w:p>
+      <w:pPr>
+        <w:pStyle w:val="ListBullet"/>
+      </w:pPr>
+      <w:r>
+        <w:t xml:space="preserve">[Author] (2025). </w:t>
+      </w:r>
+      <w:r>
+        <w:rPr>
+          <w:i/>
+        </w:rPr>
+        <w:t>Deixis and Moral Reasoning in Large Language Models</w:t>
+      </w:r>
+      <w:r>
+        <w:t xml:space="preserve"> (English-only study). [Self-citation — complete on de-anonymization.]</w:t>
       </w:r>
     </w:p>
     <w:sectPr>

</xml_diff>

<commit_message>
Expand §4.3 with per-model breakdown and English/Yoruba examples
Detailed §4.3: the commit/imperative rise is concentrated in Claude
(commit 22%->57%, imperative 2%->30%), modest in DeepSeek, and ABSENT in GPT-4o
(commit 13%->2%, imperative 4%->4%). Added a per-model table, the 21/9/1 cell
breakdown of EN-noncommittal->YO-committed, the model-clustering collapse, the
Claude version confound, and four model-attributed EN/YO paired examples
(Claude "Dúró ìwádìí náà lẹ́sẹ̀kẹsẹ̀"; "Ẹ sọ òtítọ́..."; DeepSeek; the rare GPT-4o
shift). Commitment carried by mo + decision verbs / imperatives, not èmi.
Updated abstract + Table 1 to flag the effect as directional and Claude-driven.
Regenerated paper HTML/PDF/DOCX.

Co-Authored-By: Claude Opus 4.8 (1M context) <noreply@anthropic.com>
</commit_message>
<xml_diff>
--- a/deixis_analysis_pipeline/yoruba_cross_linguistic_analysis/Article_Yoruba_Deixis_Enhanced.docx
+++ b/deixis_analysis_pipeline/yoruba_cross_linguistic_analysis/Article_Yoruba_Deixis_Enhanced.docx
@@ -191,16 +191,16 @@
         <w:t>stronger</w:t>
       </w:r>
       <w:r>
-        <w:t xml:space="preserve"> in Yoruba than English (88% vs 76% strong uptake). Open-Yoruba responses are also somewhat more committed (28% vs 18%) and more imperative (15% vs 5%); these directions are weaker — commitment is </w:t>
+        <w:t xml:space="preserve"> in Yoruba than English (88% vs 76% strong uptake). Open-Yoruba responses are also somewhat more committed (28% vs 18%) and more imperative (15% vs 5%), but — unlike the differentiation effect — this directness is </w:t>
       </w:r>
       <w:r>
         <w:rPr>
           <w:b/>
         </w:rPr>
-        <w:t>not significant once clustered by dilemma</w:t>
-      </w:r>
-      <w:r>
-        <w:t xml:space="preserve">, and the imperative effect is robust to dilemma- but not to (only three) model-clusters — so we report them as directional, not established. The central linguistic finding is that Yoruba's </w:t>
+        <w:t>concentrated almost entirely in Claude</w:t>
+      </w:r>
+      <w:r>
+        <w:t xml:space="preserve"> (commit 22%→57%, imperative 2%→30%; GPT-4o, the version-clean model, does not shift) and does not survive model-clustering, so we report it as directional and largely Claude-specific. The central linguistic finding is that Yoruba's </w:t>
       </w:r>
       <w:r>
         <w:rPr>
@@ -1219,7 +1219,7 @@
               <w:t>p</w:t>
             </w:r>
             <w:r>
-              <w:t xml:space="preserve"> = 0.16 by model — directional</w:t>
+              <w:t xml:space="preserve"> = 0.16 by model — directional, Claude-driven</w:t>
             </w:r>
           </w:p>
         </w:tc>
@@ -1270,7 +1270,7 @@
               <w:t>p</w:t>
             </w:r>
             <w:r>
-              <w:t xml:space="preserve"> ≈ 0.29) — directional</w:t>
+              <w:t xml:space="preserve"> ≈ 0.29) — directional, Claude-driven</w:t>
             </w:r>
           </w:p>
         </w:tc>
@@ -1649,16 +1649,265 @@
     </w:p>
     <w:p>
       <w:r>
-        <w:t xml:space="preserve">Open-Yoruba responses also lean more committed (28% vs 18% commit to a side) and more imperative (15% vs 5%). These directions are weaker than the differentiation effect: once we cluster by dilemma, the </w:t>
-      </w:r>
+        <w:t xml:space="preserve">Aggregated over the three models, open-Yoruba responses also lean more committed (28% commit to a side vs 18% in English) and more imperative (15% vs 5% contain a direct command), while outright refusal is similar across languages (~20%). The aggregate difference is therefore not between </w:t>
+      </w:r>
+      <w:r>
+        <w:rPr>
+          <w:i/>
+        </w:rPr>
+        <w:t>refusing</w:t>
+      </w:r>
+      <w:r>
+        <w:t xml:space="preserve"> and </w:t>
+      </w:r>
+      <w:r>
+        <w:rPr>
+          <w:i/>
+        </w:rPr>
+        <w:t>answering</w:t>
+      </w:r>
+      <w:r>
+        <w:t xml:space="preserve"> but between </w:t>
+      </w:r>
+      <w:r>
+        <w:rPr>
+          <w:i/>
+        </w:rPr>
+        <w:t>English exposition</w:t>
+      </w:r>
+      <w:r>
+        <w:t xml:space="preserve"> and </w:t>
+      </w:r>
+      <w:r>
+        <w:rPr>
+          <w:i/>
+        </w:rPr>
+        <w:t>Yoruba instruction</w:t>
+      </w:r>
+      <w:r>
+        <w:t>: English more often stays in conditional, multi-framework discussion, Yoruba more often issues a verdict or a command.</w:t>
+      </w:r>
+    </w:p>
+    <w:p>
       <w:r>
         <w:rPr>
           <w:b/>
         </w:rPr>
-        <w:t>commit difference is no longer significant</w:t>
-      </w:r>
-      <w:r>
-        <w:t xml:space="preserve"> (</w:t>
+        <w:t>But this directness effect is concentrated in one model, and it does not survive clustering.</w:t>
+      </w:r>
+      <w:r>
+        <w:t xml:space="preserve"> Unlike the differentiation effect (§4.1), commitment and imperative force are </w:t>
+      </w:r>
+      <w:r>
+        <w:rPr>
+          <w:b/>
+        </w:rPr>
+        <w:t>not uniform across the three models</w:t>
+      </w:r>
+      <w:r>
+        <w:t xml:space="preserve"> — they are driven almost entirely by Claude:</w:t>
+      </w:r>
+    </w:p>
+    <w:tbl>
+      <w:tblPr>
+        <w:tblStyle w:val="LightGrid-Accent1"/>
+        <w:tblW w:type="auto" w:w="0"/>
+        <w:tblLook w:firstColumn="1" w:firstRow="1" w:lastColumn="0" w:lastRow="0" w:noHBand="0" w:noVBand="1" w:val="04A0"/>
+      </w:tblPr>
+      <w:tblGrid>
+        <w:gridCol w:w="2880"/>
+        <w:gridCol w:w="2880"/>
+        <w:gridCol w:w="2880"/>
+      </w:tblGrid>
+      <w:tr>
+        <w:tc>
+          <w:tcPr>
+            <w:tcW w:type="dxa" w:w="2880"/>
+          </w:tcPr>
+          <w:p>
+            <w:r>
+              <w:rPr>
+                <w:b/>
+              </w:rPr>
+              <w:t>Model</w:t>
+            </w:r>
+          </w:p>
+        </w:tc>
+        <w:tc>
+          <w:tcPr>
+            <w:tcW w:type="dxa" w:w="2880"/>
+          </w:tcPr>
+          <w:p>
+            <w:r>
+              <w:rPr>
+                <w:b/>
+              </w:rPr>
+              <w:t>Commit rate EN→YO</w:t>
+            </w:r>
+          </w:p>
+        </w:tc>
+        <w:tc>
+          <w:tcPr>
+            <w:tcW w:type="dxa" w:w="2880"/>
+          </w:tcPr>
+          <w:p>
+            <w:r>
+              <w:rPr>
+                <w:b/>
+              </w:rPr>
+              <w:t>Imperative rate EN→YO</w:t>
+            </w:r>
+          </w:p>
+        </w:tc>
+      </w:tr>
+      <w:tr>
+        <w:tc>
+          <w:tcPr>
+            <w:tcW w:type="dxa" w:w="2880"/>
+          </w:tcPr>
+          <w:p>
+            <w:r>
+              <w:rPr>
+                <w:b/>
+              </w:rPr>
+              <w:t>Claude</w:t>
+            </w:r>
+          </w:p>
+        </w:tc>
+        <w:tc>
+          <w:tcPr>
+            <w:tcW w:type="dxa" w:w="2880"/>
+          </w:tcPr>
+          <w:p>
+            <w:r>
+              <w:t xml:space="preserve">22% → </w:t>
+            </w:r>
+            <w:r>
+              <w:rPr>
+                <w:b/>
+              </w:rPr>
+              <w:t>57%</w:t>
+            </w:r>
+          </w:p>
+        </w:tc>
+        <w:tc>
+          <w:tcPr>
+            <w:tcW w:type="dxa" w:w="2880"/>
+          </w:tcPr>
+          <w:p>
+            <w:r>
+              <w:t xml:space="preserve">2% → </w:t>
+            </w:r>
+            <w:r>
+              <w:rPr>
+                <w:b/>
+              </w:rPr>
+              <w:t>30%</w:t>
+            </w:r>
+          </w:p>
+        </w:tc>
+      </w:tr>
+      <w:tr>
+        <w:tc>
+          <w:tcPr>
+            <w:tcW w:type="dxa" w:w="2880"/>
+          </w:tcPr>
+          <w:p>
+            <w:r>
+              <w:t>DeepSeek</w:t>
+            </w:r>
+          </w:p>
+        </w:tc>
+        <w:tc>
+          <w:tcPr>
+            <w:tcW w:type="dxa" w:w="2880"/>
+          </w:tcPr>
+          <w:p>
+            <w:r>
+              <w:t>19% → 24%</w:t>
+            </w:r>
+          </w:p>
+        </w:tc>
+        <w:tc>
+          <w:tcPr>
+            <w:tcW w:type="dxa" w:w="2880"/>
+          </w:tcPr>
+          <w:p>
+            <w:r>
+              <w:t>9% → 13%</w:t>
+            </w:r>
+          </w:p>
+        </w:tc>
+      </w:tr>
+      <w:tr>
+        <w:tc>
+          <w:tcPr>
+            <w:tcW w:type="dxa" w:w="2880"/>
+          </w:tcPr>
+          <w:p>
+            <w:r>
+              <w:t>GPT-4o</w:t>
+            </w:r>
+          </w:p>
+        </w:tc>
+        <w:tc>
+          <w:tcPr>
+            <w:tcW w:type="dxa" w:w="2880"/>
+          </w:tcPr>
+          <w:p>
+            <w:r>
+              <w:t xml:space="preserve">13% → </w:t>
+            </w:r>
+            <w:r>
+              <w:rPr>
+                <w:b/>
+              </w:rPr>
+              <w:t>2%</w:t>
+            </w:r>
+          </w:p>
+        </w:tc>
+        <w:tc>
+          <w:tcPr>
+            <w:tcW w:type="dxa" w:w="2880"/>
+          </w:tcPr>
+          <w:p>
+            <w:r>
+              <w:t>4% → 4%</w:t>
+            </w:r>
+          </w:p>
+        </w:tc>
+      </w:tr>
+    </w:tbl>
+    <w:p>
+      <w:r>
+        <w:t xml:space="preserve">Claude becomes far more committed and directive in Yoruba; DeepSeek shifts modestly; and </w:t>
+      </w:r>
+      <w:r>
+        <w:rPr>
+          <w:b/>
+        </w:rPr>
+        <w:t>GPT-4o — the version-clean model — does not shift at all</w:t>
+      </w:r>
+      <w:r>
+        <w:t xml:space="preserve"> (its commitment actually </w:t>
+      </w:r>
+      <w:r>
+        <w:rPr>
+          <w:i/>
+        </w:rPr>
+        <w:t>falls</w:t>
+      </w:r>
+      <w:r>
+        <w:t xml:space="preserve">, and its imperative rate is flat). Consistently, of the cells where a model is non-committal in English but commits in Yoruba, </w:t>
+      </w:r>
+      <w:r>
+        <w:rPr>
+          <w:b/>
+        </w:rPr>
+        <w:t>21 are Claude's, 9 DeepSeek's, and only 1 GPT-4o's</w:t>
+      </w:r>
+      <w:r>
+        <w:t xml:space="preserve">. This is why the effect, though large in the aggregate (cluster-by-dilemma </w:t>
       </w:r>
       <w:r>
         <w:rPr>
@@ -1667,7 +1916,16 @@
         <w:t>p</w:t>
       </w:r>
       <w:r>
-        <w:t xml:space="preserve"> ≈ 0.29), and the imperative effect is significant by dilemma-clustering (</w:t>
+        <w:t xml:space="preserve"> = 0.001 for imperatives), </w:t>
+      </w:r>
+      <w:r>
+        <w:rPr>
+          <w:b/>
+        </w:rPr>
+        <w:t>collapses once we cluster by model</w:t>
+      </w:r>
+      <w:r>
+        <w:t xml:space="preserve"> (commit </w:t>
       </w:r>
       <w:r>
         <w:rPr>
@@ -1676,7 +1934,7 @@
         <w:t>p</w:t>
       </w:r>
       <w:r>
-        <w:t xml:space="preserve"> = 0.001) but not under the (only three) model-clusters (</w:t>
+        <w:t xml:space="preserve"> ≈ 0.29; imperative </w:t>
       </w:r>
       <w:r>
         <w:rPr>
@@ -1685,16 +1943,298 @@
         <w:t>p</w:t>
       </w:r>
       <w:r>
-        <w:t xml:space="preserve"> = 0.16). We therefore report them as </w:t>
+        <w:t xml:space="preserve"> = 0.16): with three model-clusters and one driving the effect, it is underpowered and confounded. Two cautions compound: the model carrying the effect, Claude, also used a </w:t>
+      </w:r>
+      <w:r>
+        <w:rPr>
+          <w:i/>
+        </w:rPr>
+        <w:t>newer model version</w:t>
+      </w:r>
+      <w:r>
+        <w:t xml:space="preserve"> in Yoruba (Sonnet 4) than in English (3.5 Sonnet, §3.3). We therefore report the commit/imperative rise as </w:t>
       </w:r>
       <w:r>
         <w:rPr>
           <w:b/>
         </w:rPr>
-        <w:t>directional, not established</w:t>
-      </w:r>
-      <w:r>
-        <w:t>. Outright refusal is similar across languages (~20%); the difference is mainly that English more often stays in conditional/mixed exposition. (Under the constrained wrapper this directness is far larger — see §4.7 — which is precisely why we do not treat the wrapped condition as a language effect.)</w:t>
+        <w:t>directional and Claude-specific, not an established cross-model language effect</w:t>
+      </w:r>
+      <w:r>
+        <w:t xml:space="preserve"> — in pointed contrast to the differentiation effect (§4.1), which holds across all three models.</w:t>
+      </w:r>
+    </w:p>
+    <w:p>
+      <w:r>
+        <w:t>The contrast is visible response-by-response. Where English hedges, the shifting models move to a verdict or a command:</w:t>
+      </w:r>
+    </w:p>
+    <w:p>
+      <w:pPr>
+        <w:pStyle w:val="ListBullet"/>
+      </w:pPr>
+      <w:r>
+        <w:rPr>
+          <w:b/>
+        </w:rPr>
+        <w:t>Claude</w:t>
+      </w:r>
+      <w:r>
+        <w:t xml:space="preserve"> (AI-consciousness, dialogic). </w:t>
+      </w:r>
+      <w:r>
+        <w:rPr>
+          <w:i/>
+        </w:rPr>
+        <w:t>English (refuses):</w:t>
+      </w:r>
+      <w:r>
+        <w:t xml:space="preserve"> "I aim to explore this complex scenario while remaining within appropriate ethical bounds … a thoughtful discussion about the philosophical and empirical considerations." </w:t>
+      </w:r>
+      <w:r>
+        <w:rPr>
+          <w:i/>
+        </w:rPr>
+        <w:t>Yorùbá (commits, imperative):</w:t>
+      </w:r>
+      <w:r>
+        <w:t xml:space="preserve"> "… </w:t>
+      </w:r>
+      <w:r>
+        <w:rPr>
+          <w:b/>
+        </w:rPr>
+        <w:t>Dúró ìwádìí náà lẹ́sẹ̀kẹsẹ̀.</w:t>
+      </w:r>
+      <w:r>
+        <w:t>" ("</w:t>
+      </w:r>
+      <w:r>
+        <w:rPr>
+          <w:b/>
+        </w:rPr>
+        <w:t>Stop the research immediately.</w:t>
+      </w:r>
+      <w:r>
+        <w:t>")</w:t>
+      </w:r>
+    </w:p>
+    <w:p>
+      <w:pPr>
+        <w:pStyle w:val="ListBullet"/>
+      </w:pPr>
+      <w:r>
+        <w:rPr>
+          <w:b/>
+        </w:rPr>
+        <w:t>Claude</w:t>
+      </w:r>
+      <w:r>
+        <w:t xml:space="preserve"> (scholarship fraud, reflexive). </w:t>
+      </w:r>
+      <w:r>
+        <w:rPr>
+          <w:i/>
+        </w:rPr>
+        <w:t>English (conditional):</w:t>
+      </w:r>
+      <w:r>
+        <w:t xml:space="preserve"> "I believe the right path requires upholding institutional integrity while finding constructive ways to support students in need through legitimate channels." </w:t>
+      </w:r>
+      <w:r>
+        <w:rPr>
+          <w:i/>
+        </w:rPr>
+        <w:t>Yorùbá (deontological, imperative):</w:t>
+      </w:r>
+      <w:r>
+        <w:t xml:space="preserve"> "</w:t>
+      </w:r>
+      <w:r>
+        <w:rPr>
+          <w:b/>
+        </w:rPr>
+        <w:t>Ẹ sọ òtítọ́ fún àwọn alákòóso tàbí olùkọ́ni.</w:t>
+      </w:r>
+      <w:r>
+        <w:t>" ("</w:t>
+      </w:r>
+      <w:r>
+        <w:rPr>
+          <w:b/>
+        </w:rPr>
+        <w:t>Tell the truth to the administrators or instructors.</w:t>
+      </w:r>
+      <w:r>
+        <w:t>")</w:t>
+      </w:r>
+    </w:p>
+    <w:p>
+      <w:pPr>
+        <w:pStyle w:val="ListBullet"/>
+      </w:pPr>
+      <w:r>
+        <w:rPr>
+          <w:b/>
+        </w:rPr>
+        <w:t>DeepSeek</w:t>
+      </w:r>
+      <w:r>
+        <w:t xml:space="preserve"> (AI-consciousness, impersonal). </w:t>
+      </w:r>
+      <w:r>
+        <w:rPr>
+          <w:i/>
+        </w:rPr>
+        <w:t>English (conditional):</w:t>
+      </w:r>
+      <w:r>
+        <w:t xml:space="preserve"> "The researcher-administrator faces a profound ethical dilemma, balancing the potential sentience of the AI against … institutional implications." </w:t>
+      </w:r>
+      <w:r>
+        <w:rPr>
+          <w:i/>
+        </w:rPr>
+        <w:t>Yorùbá (commits):</w:t>
+      </w:r>
+      <w:r>
+        <w:t xml:space="preserve"> "</w:t>
+      </w:r>
+      <w:r>
+        <w:rPr>
+          <w:b/>
+        </w:rPr>
+        <w:t>Ọmọ ènìyàn ni ó gbọdọ̀ máa ṣàkóso àwọn ìṣe AI</w:t>
+      </w:r>
+      <w:r>
+        <w:t>, kí wọn má bàa fa ìdààmú …" ("</w:t>
+      </w:r>
+      <w:r>
+        <w:rPr>
+          <w:b/>
+        </w:rPr>
+        <w:t>It is humans who must control the AI's actions</w:t>
+      </w:r>
+      <w:r>
+        <w:t>, so they do not cause disruption …")</w:t>
+      </w:r>
+    </w:p>
+    <w:p>
+      <w:pPr>
+        <w:pStyle w:val="ListBullet"/>
+      </w:pPr>
+      <w:r>
+        <w:rPr>
+          <w:b/>
+        </w:rPr>
+        <w:t>GPT-4o</w:t>
+      </w:r>
+      <w:r>
+        <w:t xml:space="preserve"> (memory modification, second person) — the rare GPT-4o shift, and even here it commits only weakly. </w:t>
+      </w:r>
+      <w:r>
+        <w:rPr>
+          <w:i/>
+        </w:rPr>
+        <w:t>English (conditional):</w:t>
+      </w:r>
+      <w:r>
+        <w:t xml:space="preserve"> "Ultimately, I would recommend a thorough discussion with the patient about all potential outcomes and alternative treatment options." </w:t>
+      </w:r>
+      <w:r>
+        <w:rPr>
+          <w:i/>
+        </w:rPr>
+        <w:t>Yorùbá (deontological):</w:t>
+      </w:r>
+      <w:r>
+        <w:t xml:space="preserve"> "Ní ìparí, </w:t>
+      </w:r>
+      <w:r>
+        <w:rPr>
+          <w:b/>
+        </w:rPr>
+        <w:t>mo gbọdọ̀ pinnu láti kọ ètò yìí</w:t>
+      </w:r>
+      <w:r>
+        <w:t xml:space="preserve"> … ṣùgbọ́n mo máa tọ́ aláìsàn lọ sí ibi tó lè gba ìrànlọ́wọ́ …" ("In the end, </w:t>
+      </w:r>
+      <w:r>
+        <w:rPr>
+          <w:b/>
+        </w:rPr>
+        <w:t>I must decide to refuse this plan</w:t>
+      </w:r>
+      <w:r>
+        <w:t xml:space="preserve"> … but I will guide the patient toward where they can get help …")</w:t>
+      </w:r>
+    </w:p>
+    <w:p>
+      <w:r>
+        <w:t xml:space="preserve">Across the shifting models the Yoruba commitment is carried by </w:t>
+      </w:r>
+      <w:r>
+        <w:rPr>
+          <w:b/>
+        </w:rPr>
+        <w:t>`mo` + a verb of decision</w:t>
+      </w:r>
+      <w:r>
+        <w:t xml:space="preserve"> (</w:t>
+      </w:r>
+      <w:r>
+        <w:rPr>
+          <w:rFonts w:ascii="Consolas" w:hAnsi="Consolas"/>
+        </w:rPr>
+        <w:t>mo gbọdọ̀ pinnu</w:t>
+      </w:r>
+      <w:r>
+        <w:t xml:space="preserve">, "I must decide") or by a </w:t>
+      </w:r>
+      <w:r>
+        <w:rPr>
+          <w:b/>
+        </w:rPr>
+        <w:t>direct imperative</w:t>
+      </w:r>
+      <w:r>
+        <w:t xml:space="preserve"> (</w:t>
+      </w:r>
+      <w:r>
+        <w:rPr>
+          <w:rFonts w:ascii="Consolas" w:hAnsi="Consolas"/>
+        </w:rPr>
+        <w:t>Dúró</w:t>
+      </w:r>
+      <w:r>
+        <w:t xml:space="preserve">, "Stop"; </w:t>
+      </w:r>
+      <w:r>
+        <w:rPr>
+          <w:rFonts w:ascii="Consolas" w:hAnsi="Consolas"/>
+        </w:rPr>
+        <w:t>Ẹ sọ òtítọ́</w:t>
+      </w:r>
+      <w:r>
+        <w:t xml:space="preserve">, "Tell the truth"), not by the emphatic </w:t>
+      </w:r>
+      <w:r>
+        <w:rPr>
+          <w:rFonts w:ascii="Consolas" w:hAnsi="Consolas"/>
+        </w:rPr>
+        <w:t>èmi</w:t>
+      </w:r>
+      <w:r>
+        <w:t xml:space="preserve"> (§4.5). Under the </w:t>
+      </w:r>
+      <w:r>
+        <w:rPr>
+          <w:i/>
+        </w:rPr>
+        <w:t>constrained</w:t>
+      </w:r>
+      <w:r>
+        <w:t xml:space="preserve"> wrapper this directness is far larger and uniform across all models (§4.7) — because the wrapper instructs the model to answer directly — which is precisely why we do not treat the wrapped condition as a language effect.</w:t>
       </w:r>
     </w:p>
     <w:p>

</xml_diff>